<commit_message>
Add MD to DOCX converter script and initial DOCX file
- Introduced a new script `MD_to_DOCX_Converter.py` that converts Markdown files to Word DOCX format with active hyperlinks.
- The converter ensures that bookmarks and links are properly formatted for compatibility with Word and LibreOffice.
- Added functionality to normalize anchors and links to maintain consistency between headings and their corresponding bookmarks.
- Created a sample DOCX file `testing-issue.docx` for testing purposes.
</commit_message>
<xml_diff>
--- a/docs/docx/SSO.docx
+++ b/docs/docx/SSO.docx
@@ -2,33 +2,7 @@
 <file path=word/document.xml><?xml version="1.0" encoding="utf-8"?>
 <w:document xmlns:w="http://schemas.openxmlformats.org/wordprocessingml/2006/main" xmlns:m="http://schemas.openxmlformats.org/officeDocument/2006/math" xmlns:r="http://schemas.openxmlformats.org/officeDocument/2006/relationships" xmlns:o="urn:schemas-microsoft-com:office:office" xmlns:v="urn:schemas-microsoft-com:vml" xmlns:w10="urn:schemas-microsoft-com:office:word" xmlns:a="http://schemas.openxmlformats.org/drawingml/2006/main" xmlns:pic="http://schemas.openxmlformats.org/drawingml/2006/picture" xmlns:wp="http://schemas.openxmlformats.org/drawingml/2006/wordprocessingDrawing">
   <w:body>
-    <w:sdt>
-      <w:sdtPr>
-        <w:docPartObj>
-          <w:docPartGallery w:val="Table of Contents"/>
-          <w:docPartUnique/>
-        </w:docPartObj>
-      </w:sdtPr>
-      <w:sdtContent>
-        <w:p>
-          <w:pPr>
-            <w:pStyle w:val="TOCHeading"/>
-          </w:pPr>
-          <w:r>
-            <w:t xml:space="preserve">Table of Contents</w:t>
-          </w:r>
-        </w:p>
-        <w:p>
-          <w:r>
-            <w:fldChar w:fldCharType="begin" w:dirty="true"/>
-            <w:instrText xml:space="preserve">TOC \o "1-6" \h \z \u</w:instrText>
-            <w:fldChar w:fldCharType="separate"/>
-            <w:fldChar w:fldCharType="end"/>
-          </w:r>
-        </w:p>
-      </w:sdtContent>
-    </w:sdt>
-    <w:bookmarkStart w:id="64" w:name="single-sign-on-sso-architecture"/>
+    <w:bookmarkStart w:id="86" w:name="sec1"/>
     <w:p>
       <w:pPr>
         <w:pStyle w:val="Heading1"/>
@@ -37,12 +11,7 @@
         <w:t xml:space="preserve">Single Sign-On (SSO) Architecture</w:t>
       </w:r>
     </w:p>
-    <w:p>
-      <w:pPr>
-        <w:pStyle w:val="FirstParagraph"/>
-      </w:pPr>
-    </w:p>
-    <w:bookmarkStart w:id="9" w:name="table-of-contents"/>
+    <w:bookmarkStart w:id="9" w:name="sec2"/>
     <w:p>
       <w:pPr>
         <w:pStyle w:val="Heading2"/>
@@ -59,7 +28,7 @@
           <w:numId w:val="1001"/>
         </w:numPr>
       </w:pPr>
-      <w:hyperlink w:anchor="executive-summary-for-leadership">
+      <w:hyperlink w:anchor="sec3">
         <w:r>
           <w:rPr>
             <w:rStyle w:val="Hyperlink"/>
@@ -76,7 +45,7 @@
           <w:numId w:val="1001"/>
         </w:numPr>
       </w:pPr>
-      <w:hyperlink w:anchor="Xdc0be9a61259cde9adf7fd2846184224d15de99">
+      <w:hyperlink w:anchor="sec4">
         <w:r>
           <w:rPr>
             <w:rStyle w:val="Hyperlink"/>
@@ -93,7 +62,7 @@
           <w:numId w:val="1001"/>
         </w:numPr>
       </w:pPr>
-      <w:hyperlink w:anchor="overview">
+      <w:hyperlink w:anchor="sec5">
         <w:r>
           <w:rPr>
             <w:rStyle w:val="Hyperlink"/>
@@ -110,7 +79,7 @@
           <w:numId w:val="1001"/>
         </w:numPr>
       </w:pPr>
-      <w:hyperlink w:anchor="Xf17168e0183f127763daa18ccc1844d00999f35">
+      <w:hyperlink w:anchor="sec6">
         <w:r>
           <w:rPr>
             <w:rStyle w:val="Hyperlink"/>
@@ -127,7 +96,7 @@
           <w:numId w:val="1002"/>
         </w:numPr>
       </w:pPr>
-      <w:hyperlink w:anchor="X038dc2de7e81f902508e275272034080ab50196">
+      <w:hyperlink w:anchor="sec7">
         <w:r>
           <w:rPr>
             <w:rStyle w:val="Hyperlink"/>
@@ -144,7 +113,7 @@
           <w:numId w:val="1001"/>
         </w:numPr>
       </w:pPr>
-      <w:hyperlink w:anchor="Xa3ac782be2d78c7f57d482e850dff845aff19d4">
+      <w:hyperlink w:anchor="sec8">
         <w:r>
           <w:rPr>
             <w:rStyle w:val="Hyperlink"/>
@@ -161,7 +130,7 @@
           <w:numId w:val="1001"/>
         </w:numPr>
       </w:pPr>
-      <w:hyperlink w:anchor="X131f25ad912bcbc611e463c5858706d90df2fb7">
+      <w:hyperlink w:anchor="sec9">
         <w:r>
           <w:rPr>
             <w:rStyle w:val="Hyperlink"/>
@@ -178,7 +147,7 @@
           <w:numId w:val="1001"/>
         </w:numPr>
       </w:pPr>
-      <w:hyperlink w:anchor="Xb7c8cba14d21923ae1c6bd2d34753bc2db1ae4e">
+      <w:hyperlink w:anchor="sec10">
         <w:r>
           <w:rPr>
             <w:rStyle w:val="Hyperlink"/>
@@ -195,7 +164,7 @@
           <w:numId w:val="1001"/>
         </w:numPr>
       </w:pPr>
-      <w:hyperlink w:anchor="X423a10ec3f2c7866e318cbf61669c72d66231ea">
+      <w:hyperlink w:anchor="sec11">
         <w:r>
           <w:rPr>
             <w:rStyle w:val="Hyperlink"/>
@@ -212,7 +181,7 @@
           <w:numId w:val="1001"/>
         </w:numPr>
       </w:pPr>
-      <w:hyperlink w:anchor="Xafbcd3fc505e44bf7a0b18d27fed318d3709096">
+      <w:hyperlink w:anchor="sec12">
         <w:r>
           <w:rPr>
             <w:rStyle w:val="Hyperlink"/>
@@ -229,7 +198,7 @@
           <w:numId w:val="1003"/>
         </w:numPr>
       </w:pPr>
-      <w:hyperlink w:anchor="X5a0e1a6e8eb62bbe0b23c51cb89be4718723c79">
+      <w:hyperlink w:anchor="sec13">
         <w:r>
           <w:rPr>
             <w:rStyle w:val="Hyperlink"/>
@@ -246,7 +215,7 @@
           <w:numId w:val="1003"/>
         </w:numPr>
       </w:pPr>
-      <w:hyperlink w:anchor="Xeb2e31e56c172bb08d6dfe229bfe0494f12aa78">
+      <w:hyperlink w:anchor="sec14">
         <w:r>
           <w:rPr>
             <w:rStyle w:val="Hyperlink"/>
@@ -263,7 +232,7 @@
           <w:numId w:val="1003"/>
         </w:numPr>
       </w:pPr>
-      <w:hyperlink w:anchor="X58f00bcba9180c0f2f5e68db26fda9b8f73c85d">
+      <w:hyperlink w:anchor="sec15">
         <w:r>
           <w:rPr>
             <w:rStyle w:val="Hyperlink"/>
@@ -280,7 +249,7 @@
           <w:numId w:val="1003"/>
         </w:numPr>
       </w:pPr>
-      <w:hyperlink w:anchor="Xe59ad003f23fbe56231232242e5ce00d646a2a2">
+      <w:hyperlink w:anchor="sec16">
         <w:r>
           <w:rPr>
             <w:rStyle w:val="Hyperlink"/>
@@ -297,7 +266,7 @@
           <w:numId w:val="1003"/>
         </w:numPr>
       </w:pPr>
-      <w:hyperlink w:anchor="X5a9ee33004fe736c54b0fac4373b78a0d66a8f7">
+      <w:hyperlink w:anchor="sec17">
         <w:r>
           <w:rPr>
             <w:rStyle w:val="Hyperlink"/>
@@ -314,7 +283,7 @@
           <w:numId w:val="1003"/>
         </w:numPr>
       </w:pPr>
-      <w:hyperlink w:anchor="X233d0dff937599a37851c1bceed2541fb67eac3">
+      <w:hyperlink w:anchor="sec18">
         <w:r>
           <w:rPr>
             <w:rStyle w:val="Hyperlink"/>
@@ -331,7 +300,7 @@
           <w:numId w:val="1003"/>
         </w:numPr>
       </w:pPr>
-      <w:hyperlink w:anchor="X3a43a193f5f95eb1a6a6546b39accb074106288">
+      <w:hyperlink w:anchor="sec19">
         <w:r>
           <w:rPr>
             <w:rStyle w:val="Hyperlink"/>
@@ -348,7 +317,7 @@
           <w:numId w:val="1003"/>
         </w:numPr>
       </w:pPr>
-      <w:hyperlink w:anchor="Xf91ec06246985c28a3a9c15da31e3b85f1e43fe">
+      <w:hyperlink w:anchor="sec20">
         <w:r>
           <w:rPr>
             <w:rStyle w:val="Hyperlink"/>
@@ -365,7 +334,7 @@
           <w:numId w:val="1001"/>
         </w:numPr>
       </w:pPr>
-      <w:hyperlink w:anchor="Xe9f4e0115f8b216aeaf60a8bf76a950fd5db57c">
+      <w:hyperlink w:anchor="sec21">
         <w:r>
           <w:rPr>
             <w:rStyle w:val="Hyperlink"/>
@@ -382,7 +351,7 @@
           <w:numId w:val="1004"/>
         </w:numPr>
       </w:pPr>
-      <w:hyperlink w:anchor="X344986336b97abac5223c8aed3cd94a40869bf2">
+      <w:hyperlink w:anchor="sec22">
         <w:r>
           <w:rPr>
             <w:rStyle w:val="Hyperlink"/>
@@ -399,7 +368,7 @@
           <w:numId w:val="1004"/>
         </w:numPr>
       </w:pPr>
-      <w:hyperlink w:anchor="X88d23b6249b035c363626366f257dc89ddca842">
+      <w:hyperlink w:anchor="sec23">
         <w:r>
           <w:rPr>
             <w:rStyle w:val="Hyperlink"/>
@@ -416,7 +385,7 @@
           <w:numId w:val="1004"/>
         </w:numPr>
       </w:pPr>
-      <w:hyperlink w:anchor="X98ed3534d2abdd3330f38260c9198988952a39e">
+      <w:hyperlink w:anchor="sec24">
         <w:r>
           <w:rPr>
             <w:rStyle w:val="Hyperlink"/>
@@ -433,7 +402,7 @@
           <w:numId w:val="1001"/>
         </w:numPr>
       </w:pPr>
-      <w:hyperlink w:anchor="Xd0fb1be99eb56e60f3d2a1465e8e027f9709f18">
+      <w:hyperlink w:anchor="sec25">
         <w:r>
           <w:rPr>
             <w:rStyle w:val="Hyperlink"/>
@@ -450,7 +419,7 @@
           <w:numId w:val="1005"/>
         </w:numPr>
       </w:pPr>
-      <w:hyperlink w:anchor="Xc34fcf6697fc60e5ea0168d9022608e8bffc3d2">
+      <w:hyperlink w:anchor="sec26">
         <w:r>
           <w:rPr>
             <w:rStyle w:val="Hyperlink"/>
@@ -467,7 +436,7 @@
           <w:numId w:val="1005"/>
         </w:numPr>
       </w:pPr>
-      <w:hyperlink w:anchor="X09cdd26f3a9bfdbb7ad6c36010a4c0c0173e1eb">
+      <w:hyperlink w:anchor="sec27">
         <w:r>
           <w:rPr>
             <w:rStyle w:val="Hyperlink"/>
@@ -484,7 +453,7 @@
           <w:numId w:val="1005"/>
         </w:numPr>
       </w:pPr>
-      <w:hyperlink w:anchor="X9da7dba132bb86b93350c2a316ce4491626f85c">
+      <w:hyperlink w:anchor="sec28">
         <w:r>
           <w:rPr>
             <w:rStyle w:val="Hyperlink"/>
@@ -501,7 +470,7 @@
           <w:numId w:val="1005"/>
         </w:numPr>
       </w:pPr>
-      <w:hyperlink w:anchor="Xfd7104eac19eacbf1ab9f0aeb84237195faa9b1">
+      <w:hyperlink w:anchor="sec31">
         <w:r>
           <w:rPr>
             <w:rStyle w:val="Hyperlink"/>
@@ -518,7 +487,7 @@
           <w:numId w:val="1005"/>
         </w:numPr>
       </w:pPr>
-      <w:hyperlink w:anchor="X94e486b28fa4b9066d7001078aac70e5cd92977">
+      <w:hyperlink w:anchor="sec32">
         <w:r>
           <w:rPr>
             <w:rStyle w:val="Hyperlink"/>
@@ -535,7 +504,7 @@
           <w:numId w:val="1001"/>
         </w:numPr>
       </w:pPr>
-      <w:hyperlink w:anchor="core-security-architecture-matrix">
+      <w:hyperlink w:anchor="sec33">
         <w:r>
           <w:rPr>
             <w:rStyle w:val="Hyperlink"/>
@@ -552,7 +521,7 @@
           <w:numId w:val="1001"/>
         </w:numPr>
       </w:pPr>
-      <w:hyperlink w:anchor="references">
+      <w:hyperlink w:anchor="sec34">
         <w:r>
           <w:rPr>
             <w:rStyle w:val="Hyperlink"/>
@@ -561,13 +530,8 @@
         </w:r>
       </w:hyperlink>
     </w:p>
-    <w:p>
-      <w:pPr>
-        <w:pStyle w:val="FirstParagraph"/>
-      </w:pPr>
-    </w:p>
     <w:bookmarkEnd w:id="9"/>
-    <w:bookmarkStart w:id="10" w:name="executive-summary-for-leadership"/>
+    <w:bookmarkStart w:id="10" w:name="sec3"/>
     <w:p>
       <w:pPr>
         <w:pStyle w:val="Heading2"/>
@@ -671,13 +635,8 @@
         <w:t xml:space="preserve">: one sign-on per day instead of 50+, near-zero lockout tickets, faster outage response, and a defensible audit trail.</w:t>
       </w:r>
     </w:p>
-    <w:p>
-      <w:pPr>
-        <w:pStyle w:val="FirstParagraph"/>
-      </w:pPr>
-    </w:p>
     <w:bookmarkEnd w:id="10"/>
-    <w:bookmarkStart w:id="11" w:name="Xdc0be9a61259cde9adf7fd2846184224d15de99"/>
+    <w:bookmarkStart w:id="11" w:name="sec4"/>
     <w:p>
       <w:pPr>
         <w:pStyle w:val="Heading2"/>
@@ -784,13 +743,8 @@
         <w:t xml:space="preserve">(iLO cert enrolment, Nodegrid SAML claims, RDP GPOs); Sections 1–5 describe the architecture they implement.</w:t>
       </w:r>
     </w:p>
-    <w:p>
-      <w:pPr>
-        <w:pStyle w:val="FirstParagraph"/>
-      </w:pPr>
-    </w:p>
     <w:bookmarkEnd w:id="11"/>
-    <w:bookmarkStart w:id="12" w:name="overview"/>
+    <w:bookmarkStart w:id="12" w:name="sec5"/>
     <w:p>
       <w:pPr>
         <w:pStyle w:val="Heading2"/>
@@ -913,13 +867,8 @@
         </w:pict>
       </w:r>
     </w:p>
-    <w:p>
-      <w:pPr>
-        <w:pStyle w:val="FirstParagraph"/>
-      </w:pPr>
-    </w:p>
     <w:bookmarkEnd w:id="12"/>
-    <w:bookmarkStart w:id="14" w:name="Xfed887c51483ff8f29303f5875b0dac8616ee92"/>
+    <w:bookmarkStart w:id="14" w:name="sec6"/>
     <w:p>
       <w:pPr>
         <w:pStyle w:val="Heading2"/>
@@ -985,12 +934,7 @@
         </w:r>
       </w:hyperlink>
     </w:p>
-    <w:p>
-      <w:pPr>
-        <w:pStyle w:val="FirstParagraph"/>
-      </w:pPr>
-    </w:p>
-    <w:bookmarkStart w:id="13" w:name="X6e3eda7757a9e833ed5ab7af7830829808acaa4"/>
+    <w:bookmarkStart w:id="13" w:name="sec7"/>
     <w:p>
       <w:pPr>
         <w:pStyle w:val="Heading3"/>
@@ -1388,14 +1332,9 @@
         </w:tc>
       </w:tr>
     </w:tbl>
-    <w:p>
-      <w:pPr>
-        <w:pStyle w:val="BodyText"/>
-      </w:pPr>
-    </w:p>
     <w:bookmarkEnd w:id="13"/>
     <w:bookmarkEnd w:id="14"/>
-    <w:bookmarkStart w:id="15" w:name="bare-metal-management-layer-ilo-redfish"/>
+    <w:bookmarkStart w:id="15" w:name="sec8"/>
     <w:p>
       <w:pPr>
         <w:pStyle w:val="Heading2"/>
@@ -1551,13 +1490,8 @@
         </w:r>
       </w:hyperlink>
     </w:p>
-    <w:p>
-      <w:pPr>
-        <w:pStyle w:val="FirstParagraph"/>
-      </w:pPr>
-    </w:p>
     <w:bookmarkEnd w:id="15"/>
-    <w:bookmarkStart w:id="16" w:name="out-of-band-network-access-zpe-nodegrid"/>
+    <w:bookmarkStart w:id="16" w:name="sec9"/>
     <w:p>
       <w:pPr>
         <w:pStyle w:val="Heading2"/>
@@ -1752,13 +1686,8 @@
         </w:r>
       </w:hyperlink>
     </w:p>
-    <w:p>
-      <w:pPr>
-        <w:pStyle w:val="FirstParagraph"/>
-      </w:pPr>
-    </w:p>
     <w:bookmarkEnd w:id="16"/>
-    <w:bookmarkStart w:id="17" w:name="X454067b8ac88034c3a5767225c237cd7781c96c"/>
+    <w:bookmarkStart w:id="17" w:name="sec10"/>
     <w:p>
       <w:pPr>
         <w:pStyle w:val="Heading2"/>
@@ -1959,13 +1888,8 @@
         </w:r>
       </w:hyperlink>
     </w:p>
-    <w:p>
-      <w:pPr>
-        <w:pStyle w:val="FirstParagraph"/>
-      </w:pPr>
-    </w:p>
     <w:bookmarkEnd w:id="17"/>
-    <w:bookmarkStart w:id="18" w:name="monitoring-alerting-layer-microsoft-scom"/>
+    <w:bookmarkStart w:id="18" w:name="sec11"/>
     <w:p>
       <w:pPr>
         <w:pStyle w:val="Heading2"/>
@@ -2065,13 +1989,8 @@
         </w:pict>
       </w:r>
     </w:p>
-    <w:p>
-      <w:pPr>
-        <w:pStyle w:val="FirstParagraph"/>
-      </w:pPr>
-    </w:p>
     <w:bookmarkEnd w:id="18"/>
-    <w:bookmarkStart w:id="27" w:name="X6c5f3ac9653d56b152bc856c0352a8a8303c492"/>
+    <w:bookmarkStart w:id="27" w:name="sec12"/>
     <w:p>
       <w:pPr>
         <w:pStyle w:val="Heading2"/>
@@ -2104,12 +2023,7 @@
         <w:t xml:space="preserve">mode so iLO authenticates the user’s identity without prompting for iLO-local credentials.</w:t>
       </w:r>
     </w:p>
-    <w:p>
-      <w:pPr>
-        <w:pStyle w:val="BodyText"/>
-      </w:pPr>
-    </w:p>
-    <w:bookmarkStart w:id="19" w:name="prerequisites"/>
+    <w:bookmarkStart w:id="19" w:name="sec13"/>
     <w:p>
       <w:pPr>
         <w:pStyle w:val="Heading3"/>
@@ -2203,13 +2117,8 @@
         <w:t xml:space="preserve">pre-created in a Security OU (Tier-0 for admins, Tier-1 for read-only operators).</w:t>
       </w:r>
     </w:p>
-    <w:p>
-      <w:pPr>
-        <w:pStyle w:val="FirstParagraph"/>
-      </w:pPr>
-    </w:p>
     <w:bookmarkEnd w:id="19"/>
-    <w:bookmarkStart w:id="20" w:name="Xc298e2f07bc7f967813e7281211b6eea9285996"/>
+    <w:bookmarkStart w:id="20" w:name="sec14"/>
     <w:p>
       <w:pPr>
         <w:pStyle w:val="Heading3"/>
@@ -2413,13 +2322,8 @@
         <w:t xml:space="preserve">Copy the generated CSR text.</w:t>
       </w:r>
     </w:p>
-    <w:p>
-      <w:pPr>
-        <w:pStyle w:val="FirstParagraph"/>
-      </w:pPr>
-    </w:p>
     <w:bookmarkEnd w:id="20"/>
-    <w:bookmarkStart w:id="21" w:name="X280ed95b142168f5b5a4b88d0943b3dfc538327"/>
+    <w:bookmarkStart w:id="21" w:name="sec15"/>
     <w:p>
       <w:pPr>
         <w:pStyle w:val="Heading3"/>
@@ -2655,13 +2559,8 @@
         <w:t xml:space="preserve">: submit the CSR to the NDES endpoint and retrieve the full chain.</w:t>
       </w:r>
     </w:p>
-    <w:p>
-      <w:pPr>
-        <w:pStyle w:val="FirstParagraph"/>
-      </w:pPr>
-    </w:p>
     <w:bookmarkEnd w:id="21"/>
-    <w:bookmarkStart w:id="22" w:name="Xb7172588268cfb956c85a4e684042a858b8c75d"/>
+    <w:bookmarkStart w:id="22" w:name="sec16"/>
     <w:p>
       <w:pPr>
         <w:pStyle w:val="Heading3"/>
@@ -2789,13 +2688,8 @@
         <w:t xml:space="preserve">   ilorest showcert</w:t>
       </w:r>
     </w:p>
-    <w:p>
-      <w:pPr>
-        <w:pStyle w:val="FirstParagraph"/>
-      </w:pPr>
-    </w:p>
     <w:bookmarkEnd w:id="22"/>
-    <w:bookmarkStart w:id="23" w:name="X9e11e913e58caa834910d183c341a5a69a718d3"/>
+    <w:bookmarkStart w:id="23" w:name="sec17"/>
     <w:p>
       <w:pPr>
         <w:pStyle w:val="Heading3"/>
@@ -3022,13 +2916,8 @@
         <w:t xml:space="preserve">Save.</w:t>
       </w:r>
     </w:p>
-    <w:p>
-      <w:pPr>
-        <w:pStyle w:val="FirstParagraph"/>
-      </w:pPr>
-    </w:p>
     <w:bookmarkEnd w:id="23"/>
-    <w:bookmarkStart w:id="24" w:name="X61e475880d4837eb5ca6a3835d7123a7c539e69"/>
+    <w:bookmarkStart w:id="24" w:name="sec18"/>
     <w:p>
       <w:pPr>
         <w:pStyle w:val="Heading3"/>
@@ -3408,13 +3297,8 @@
         <w:t xml:space="preserve">or delete) so authentication is enforced solely through the certificate-trusted AD path.</w:t>
       </w:r>
     </w:p>
-    <w:p>
-      <w:pPr>
-        <w:pStyle w:val="BodyText"/>
-      </w:pPr>
-    </w:p>
     <w:bookmarkEnd w:id="24"/>
-    <w:bookmarkStart w:id="25" w:name="X841dda5dee47b2d2da5d489a5799d8bff1f0cd6"/>
+    <w:bookmarkStart w:id="25" w:name="sec19"/>
     <w:p>
       <w:pPr>
         <w:pStyle w:val="Heading3"/>
@@ -3542,13 +3426,8 @@
         <w:t xml:space="preserve">in OneView and get a seamless iLO session without a second login (token is brokered via the OneView-iLO trust relationship).</w:t>
       </w:r>
     </w:p>
-    <w:p>
-      <w:pPr>
-        <w:pStyle w:val="FirstParagraph"/>
-      </w:pPr>
-    </w:p>
     <w:bookmarkEnd w:id="25"/>
-    <w:bookmarkStart w:id="26" w:name="verification"/>
+    <w:bookmarkStart w:id="26" w:name="sec20"/>
     <w:p>
       <w:pPr>
         <w:pStyle w:val="Heading3"/>
@@ -3698,14 +3577,9 @@
         <w:t xml:space="preserve">.</w:t>
       </w:r>
     </w:p>
-    <w:p>
-      <w:pPr>
-        <w:pStyle w:val="FirstParagraph"/>
-      </w:pPr>
-    </w:p>
     <w:bookmarkEnd w:id="26"/>
     <w:bookmarkEnd w:id="27"/>
-    <w:bookmarkStart w:id="31" w:name="Xaae56e3a94148c4a1ab2db253eea647b8c0177b"/>
+    <w:bookmarkStart w:id="31" w:name="sec21"/>
     <w:p>
       <w:pPr>
         <w:pStyle w:val="Heading2"/>
@@ -3835,12 +3709,7 @@
         <w:t xml:space="preserve">.</w:t>
       </w:r>
     </w:p>
-    <w:p>
-      <w:pPr>
-        <w:pStyle w:val="BodyText"/>
-      </w:pPr>
-    </w:p>
-    <w:bookmarkStart w:id="28" w:name="X4dd914e64fdb013b626a22d5fa7e1ff3b09a20e"/>
+    <w:bookmarkStart w:id="28" w:name="sec22"/>
     <w:p>
       <w:pPr>
         <w:pStyle w:val="Heading3"/>
@@ -4728,13 +4597,8 @@
         <w:t xml:space="preserve">from the SAML settings page (contains the IdP cert + SSO URL + Entity ID).</w:t>
       </w:r>
     </w:p>
-    <w:p>
-      <w:pPr>
-        <w:pStyle w:val="FirstParagraph"/>
-      </w:pPr>
-    </w:p>
     <w:bookmarkEnd w:id="28"/>
-    <w:bookmarkStart w:id="29" w:name="X18bfb1474d881aeceadda1f076bca19b2fc407c"/>
+    <w:bookmarkStart w:id="29" w:name="sec23"/>
     <w:p>
       <w:pPr>
         <w:pStyle w:val="Heading3"/>
@@ -5569,13 +5433,8 @@
         <w:t xml:space="preserve">Save.</w:t>
       </w:r>
     </w:p>
-    <w:p>
-      <w:pPr>
-        <w:pStyle w:val="FirstParagraph"/>
-      </w:pPr>
-    </w:p>
     <w:bookmarkEnd w:id="29"/>
-    <w:bookmarkStart w:id="30" w:name="verification-1"/>
+    <w:bookmarkStart w:id="30" w:name="sec24"/>
     <w:p>
       <w:pPr>
         <w:pStyle w:val="Heading3"/>
@@ -5764,15 +5623,10 @@
       <w:r>
         <w:t xml:space="preserve">After Azure sign-out, Nodegrid session terminates (SLO confirmed).</w:t>
       </w:r>
-    </w:p>
-    <w:p>
-      <w:pPr>
-        <w:pStyle w:val="FirstParagraph"/>
-      </w:pPr>
     </w:p>
     <w:bookmarkEnd w:id="30"/>
     <w:bookmarkEnd w:id="31"/>
-    <w:bookmarkStart w:id="39" w:name="X91a85162b1394603ef788ad64093f116e9e54da"/>
+    <w:bookmarkStart w:id="39" w:name="sec25"/>
     <w:p>
       <w:pPr>
         <w:pStyle w:val="Heading2"/>
@@ -5877,12 +5731,7 @@
         <w:t xml:space="preserve">.</w:t>
       </w:r>
     </w:p>
-    <w:p>
-      <w:pPr>
-        <w:pStyle w:val="BodyText"/>
-      </w:pPr>
-    </w:p>
-    <w:bookmarkStart w:id="32" w:name="X496c9396fa33f137f7b371e650cb05de031ebcc"/>
+    <w:bookmarkStart w:id="32" w:name="sec26"/>
     <w:p>
       <w:pPr>
         <w:pStyle w:val="Heading3"/>
@@ -5957,13 +5806,8 @@
         <w:t xml:space="preserve">. Because no password is ever typed at the remote server, lockout-prone interactive binds do not recur.</w:t>
       </w:r>
     </w:p>
-    <w:p>
-      <w:pPr>
-        <w:pStyle w:val="BodyText"/>
-      </w:pPr>
-    </w:p>
     <w:bookmarkEnd w:id="32"/>
-    <w:bookmarkStart w:id="33" w:name="X664e365175c1f0700d44f5e9b5f5378939f17ad"/>
+    <w:bookmarkStart w:id="33" w:name="sec27"/>
     <w:p>
       <w:pPr>
         <w:pStyle w:val="Heading3"/>
@@ -6368,13 +6212,8 @@
         </w:tc>
       </w:tr>
     </w:tbl>
-    <w:p>
-      <w:pPr>
-        <w:pStyle w:val="BodyText"/>
-      </w:pPr>
-    </w:p>
     <w:bookmarkEnd w:id="33"/>
-    <w:bookmarkStart w:id="36" w:name="X015e4ec089c0d1e81794c63adf10e7e80cf12c4"/>
+    <w:bookmarkStart w:id="36" w:name="sec28"/>
     <w:p>
       <w:pPr>
         <w:pStyle w:val="Heading3"/>
@@ -6446,7 +6285,7 @@
         <w:t xml:space="preserve">.</w:t>
       </w:r>
     </w:p>
-    <w:bookmarkStart w:id="34" w:name="jump-box-engineer-workstation-tier-1"/>
+    <w:bookmarkStart w:id="34" w:name="sec29"/>
     <w:p>
       <w:pPr>
         <w:pStyle w:val="Heading4"/>
@@ -6662,7 +6501,7 @@
       </w:r>
     </w:p>
     <w:bookmarkEnd w:id="34"/>
-    <w:bookmarkStart w:id="35" w:name="rdp-target-servers-the-50-proliant-boxes"/>
+    <w:bookmarkStart w:id="35" w:name="sec30"/>
     <w:p>
       <w:pPr>
         <w:pStyle w:val="Heading4"/>
@@ -7401,14 +7240,9 @@
         <w:t xml:space="preserve">.</w:t>
       </w:r>
     </w:p>
-    <w:p>
-      <w:pPr>
-        <w:pStyle w:val="FirstParagraph"/>
-      </w:pPr>
-    </w:p>
     <w:bookmarkEnd w:id="35"/>
     <w:bookmarkEnd w:id="36"/>
-    <w:bookmarkStart w:id="37" w:name="X40c4279ebeb84ab1aa6b4e3093486b44a1f6bb5"/>
+    <w:bookmarkStart w:id="37" w:name="sec31"/>
     <w:p>
       <w:pPr>
         <w:pStyle w:val="Heading3"/>
@@ -7608,13 +7442,8 @@
         <w:t xml:space="preserve">(at the jump box), and the TGT is silently forwarded to all 50+ servers — eliminating the interactive-password-at-every-server behavior that causes lockout spikes.</w:t>
       </w:r>
     </w:p>
-    <w:p>
-      <w:pPr>
-        <w:pStyle w:val="BodyText"/>
-      </w:pPr>
-    </w:p>
     <w:bookmarkEnd w:id="37"/>
-    <w:bookmarkStart w:id="38" w:name="X3e10946e00148408dd896686d11881e53934a06"/>
+    <w:bookmarkStart w:id="38" w:name="sec32"/>
     <w:p>
       <w:pPr>
         <w:pStyle w:val="Heading3"/>
@@ -7979,14 +7808,9 @@
         </w:pict>
       </w:r>
     </w:p>
-    <w:p>
-      <w:pPr>
-        <w:pStyle w:val="FirstParagraph"/>
-      </w:pPr>
-    </w:p>
     <w:bookmarkEnd w:id="38"/>
     <w:bookmarkEnd w:id="39"/>
-    <w:bookmarkStart w:id="40" w:name="core-security-architecture-matrix"/>
+    <w:bookmarkStart w:id="40" w:name="sec33"/>
     <w:p>
       <w:pPr>
         <w:pStyle w:val="Heading2"/>
@@ -8334,13 +8158,8 @@
         </w:tc>
       </w:tr>
     </w:tbl>
-    <w:p>
-      <w:pPr>
-        <w:pStyle w:val="BodyText"/>
-      </w:pPr>
-    </w:p>
     <w:bookmarkEnd w:id="40"/>
-    <w:bookmarkStart w:id="63" w:name="references"/>
+    <w:bookmarkStart w:id="85" w:name="sec34"/>
     <w:p>
       <w:pPr>
         <w:pStyle w:val="Heading2"/>
@@ -8349,6 +8168,7 @@
         <w:t xml:space="preserve">References</w:t>
       </w:r>
     </w:p>
+    <w:bookmarkStart w:id="42" w:name="ref-1"/>
     <w:p>
       <w:pPr>
         <w:pStyle w:val="FirstParagraph"/>
@@ -8367,16 +8187,20 @@
           <w:t xml:space="preserve">https://www.pingidentity.com</w:t>
         </w:r>
       </w:hyperlink>
-      <w:r>
-        <w:br/>
-      </w:r>
+    </w:p>
+    <w:bookmarkEnd w:id="42"/>
+    <w:bookmarkStart w:id="44" w:name="ref-2"/>
+    <w:p>
+      <w:pPr>
+        <w:pStyle w:val="BodyText"/>
+      </w:pPr>
       <w:r>
         <w:t xml:space="preserve">[2]</w:t>
       </w:r>
       <w:r>
         <w:t xml:space="preserve"> </w:t>
       </w:r>
-      <w:hyperlink r:id="rId42">
+      <w:hyperlink r:id="rId43">
         <w:r>
           <w:rPr>
             <w:rStyle w:val="Hyperlink"/>
@@ -8384,16 +8208,20 @@
           <w:t xml:space="preserve">https://docs.zpesystems.com</w:t>
         </w:r>
       </w:hyperlink>
-      <w:r>
-        <w:br/>
-      </w:r>
+    </w:p>
+    <w:bookmarkEnd w:id="44"/>
+    <w:bookmarkStart w:id="46" w:name="ref-3"/>
+    <w:p>
+      <w:pPr>
+        <w:pStyle w:val="BodyText"/>
+      </w:pPr>
       <w:r>
         <w:t xml:space="preserve">[3]</w:t>
       </w:r>
       <w:r>
         <w:t xml:space="preserve"> </w:t>
       </w:r>
-      <w:hyperlink r:id="rId43">
+      <w:hyperlink r:id="rId45">
         <w:r>
           <w:rPr>
             <w:rStyle w:val="Hyperlink"/>
@@ -8401,16 +8229,20 @@
           <w:t xml:space="preserve">https://support.hpe.com</w:t>
         </w:r>
       </w:hyperlink>
-      <w:r>
-        <w:br/>
-      </w:r>
+    </w:p>
+    <w:bookmarkEnd w:id="46"/>
+    <w:bookmarkStart w:id="48" w:name="ref-4"/>
+    <w:p>
+      <w:pPr>
+        <w:pStyle w:val="BodyText"/>
+      </w:pPr>
       <w:r>
         <w:t xml:space="preserve">[4]</w:t>
       </w:r>
       <w:r>
         <w:t xml:space="preserve"> </w:t>
       </w:r>
-      <w:hyperlink r:id="rId44">
+      <w:hyperlink r:id="rId47">
         <w:r>
           <w:rPr>
             <w:rStyle w:val="Hyperlink"/>
@@ -8418,16 +8250,20 @@
           <w:t xml:space="preserve">https://www.tenable.com</w:t>
         </w:r>
       </w:hyperlink>
-      <w:r>
-        <w:br/>
-      </w:r>
+    </w:p>
+    <w:bookmarkEnd w:id="48"/>
+    <w:bookmarkStart w:id="50" w:name="ref-5"/>
+    <w:p>
+      <w:pPr>
+        <w:pStyle w:val="BodyText"/>
+      </w:pPr>
       <w:r>
         <w:t xml:space="preserve">[5]</w:t>
       </w:r>
       <w:r>
         <w:t xml:space="preserve"> </w:t>
       </w:r>
-      <w:hyperlink r:id="rId45">
+      <w:hyperlink r:id="rId49">
         <w:r>
           <w:rPr>
             <w:rStyle w:val="Hyperlink"/>
@@ -8435,16 +8271,20 @@
           <w:t xml:space="preserve">https://redfish.redoc.ly</w:t>
         </w:r>
       </w:hyperlink>
-      <w:r>
-        <w:br/>
-      </w:r>
+    </w:p>
+    <w:bookmarkEnd w:id="50"/>
+    <w:bookmarkStart w:id="52" w:name="ref-6"/>
+    <w:p>
+      <w:pPr>
+        <w:pStyle w:val="BodyText"/>
+      </w:pPr>
       <w:r>
         <w:t xml:space="preserve">[6]</w:t>
       </w:r>
       <w:r>
         <w:t xml:space="preserve"> </w:t>
       </w:r>
-      <w:hyperlink r:id="rId46">
+      <w:hyperlink r:id="rId51">
         <w:r>
           <w:rPr>
             <w:rStyle w:val="Hyperlink"/>
@@ -8452,16 +8292,20 @@
           <w:t xml:space="preserve">https://support.hpe.com</w:t>
         </w:r>
       </w:hyperlink>
-      <w:r>
-        <w:br/>
-      </w:r>
+    </w:p>
+    <w:bookmarkEnd w:id="52"/>
+    <w:bookmarkStart w:id="54" w:name="ref-7"/>
+    <w:p>
+      <w:pPr>
+        <w:pStyle w:val="BodyText"/>
+      </w:pPr>
       <w:r>
         <w:t xml:space="preserve">[7]</w:t>
       </w:r>
       <w:r>
         <w:t xml:space="preserve"> </w:t>
       </w:r>
-      <w:hyperlink r:id="rId47">
+      <w:hyperlink r:id="rId53">
         <w:r>
           <w:rPr>
             <w:rStyle w:val="Hyperlink"/>
@@ -8469,16 +8313,20 @@
           <w:t xml:space="preserve">https://support.hpe.com</w:t>
         </w:r>
       </w:hyperlink>
-      <w:r>
-        <w:br/>
-      </w:r>
+    </w:p>
+    <w:bookmarkEnd w:id="54"/>
+    <w:bookmarkStart w:id="56" w:name="ref-8"/>
+    <w:p>
+      <w:pPr>
+        <w:pStyle w:val="BodyText"/>
+      </w:pPr>
       <w:r>
         <w:t xml:space="preserve">[8]</w:t>
       </w:r>
       <w:r>
         <w:t xml:space="preserve"> </w:t>
       </w:r>
-      <w:hyperlink r:id="rId48">
+      <w:hyperlink r:id="rId55">
         <w:r>
           <w:rPr>
             <w:rStyle w:val="Hyperlink"/>
@@ -8486,16 +8334,20 @@
           <w:t xml:space="preserve">https://developer.hpe.com</w:t>
         </w:r>
       </w:hyperlink>
-      <w:r>
-        <w:br/>
-      </w:r>
+    </w:p>
+    <w:bookmarkEnd w:id="56"/>
+    <w:bookmarkStart w:id="58" w:name="ref-9"/>
+    <w:p>
+      <w:pPr>
+        <w:pStyle w:val="BodyText"/>
+      </w:pPr>
       <w:r>
         <w:t xml:space="preserve">[9]</w:t>
       </w:r>
       <w:r>
         <w:t xml:space="preserve"> </w:t>
       </w:r>
-      <w:hyperlink r:id="rId49">
+      <w:hyperlink r:id="rId57">
         <w:r>
           <w:rPr>
             <w:rStyle w:val="Hyperlink"/>
@@ -8503,16 +8355,20 @@
           <w:t xml:space="preserve">https://servermanagementportal.ext.hpe.com</w:t>
         </w:r>
       </w:hyperlink>
-      <w:r>
-        <w:br/>
-      </w:r>
+    </w:p>
+    <w:bookmarkEnd w:id="58"/>
+    <w:bookmarkStart w:id="60" w:name="ref-10"/>
+    <w:p>
+      <w:pPr>
+        <w:pStyle w:val="BodyText"/>
+      </w:pPr>
       <w:r>
         <w:t xml:space="preserve">[10]</w:t>
       </w:r>
       <w:r>
         <w:t xml:space="preserve"> </w:t>
       </w:r>
-      <w:hyperlink r:id="rId50">
+      <w:hyperlink r:id="rId59">
         <w:r>
           <w:rPr>
             <w:rStyle w:val="Hyperlink"/>
@@ -8520,16 +8376,20 @@
           <w:t xml:space="preserve">https://servermanagementportal.ext.hpe.com</w:t>
         </w:r>
       </w:hyperlink>
-      <w:r>
-        <w:br/>
-      </w:r>
+    </w:p>
+    <w:bookmarkEnd w:id="60"/>
+    <w:bookmarkStart w:id="62" w:name="ref-11"/>
+    <w:p>
+      <w:pPr>
+        <w:pStyle w:val="BodyText"/>
+      </w:pPr>
       <w:r>
         <w:t xml:space="preserve">[11]</w:t>
       </w:r>
       <w:r>
         <w:t xml:space="preserve"> </w:t>
       </w:r>
-      <w:hyperlink r:id="rId51">
+      <w:hyperlink r:id="rId61">
         <w:r>
           <w:rPr>
             <w:rStyle w:val="Hyperlink"/>
@@ -8537,16 +8397,20 @@
           <w:t xml:space="preserve">https://servermanagementportal.ext.hpe.com</w:t>
         </w:r>
       </w:hyperlink>
-      <w:r>
-        <w:br/>
-      </w:r>
+    </w:p>
+    <w:bookmarkEnd w:id="62"/>
+    <w:bookmarkStart w:id="64" w:name="ref-12"/>
+    <w:p>
+      <w:pPr>
+        <w:pStyle w:val="BodyText"/>
+      </w:pPr>
       <w:r>
         <w:t xml:space="preserve">[12]</w:t>
       </w:r>
       <w:r>
         <w:t xml:space="preserve"> </w:t>
       </w:r>
-      <w:hyperlink r:id="rId52">
+      <w:hyperlink r:id="rId63">
         <w:r>
           <w:rPr>
             <w:rStyle w:val="Hyperlink"/>
@@ -8554,16 +8418,20 @@
           <w:t xml:space="preserve">https://support.zpesystems.com</w:t>
         </w:r>
       </w:hyperlink>
-      <w:r>
-        <w:br/>
-      </w:r>
+    </w:p>
+    <w:bookmarkEnd w:id="64"/>
+    <w:bookmarkStart w:id="66" w:name="ref-13"/>
+    <w:p>
+      <w:pPr>
+        <w:pStyle w:val="BodyText"/>
+      </w:pPr>
       <w:r>
         <w:t xml:space="preserve">[13]</w:t>
       </w:r>
       <w:r>
         <w:t xml:space="preserve"> </w:t>
       </w:r>
-      <w:hyperlink r:id="rId53">
+      <w:hyperlink r:id="rId65">
         <w:r>
           <w:rPr>
             <w:rStyle w:val="Hyperlink"/>
@@ -8571,16 +8439,20 @@
           <w:t xml:space="preserve">https://docs.zpesystems.com</w:t>
         </w:r>
       </w:hyperlink>
-      <w:r>
-        <w:br/>
-      </w:r>
+    </w:p>
+    <w:bookmarkEnd w:id="66"/>
+    <w:bookmarkStart w:id="68" w:name="ref-14"/>
+    <w:p>
+      <w:pPr>
+        <w:pStyle w:val="BodyText"/>
+      </w:pPr>
       <w:r>
         <w:t xml:space="preserve">[14]</w:t>
       </w:r>
       <w:r>
         <w:t xml:space="preserve"> </w:t>
       </w:r>
-      <w:hyperlink r:id="rId54">
+      <w:hyperlink r:id="rId67">
         <w:r>
           <w:rPr>
             <w:rStyle w:val="Hyperlink"/>
@@ -8588,16 +8460,20 @@
           <w:t xml:space="preserve">https://docs.zpesystems.com</w:t>
         </w:r>
       </w:hyperlink>
-      <w:r>
-        <w:br/>
-      </w:r>
+    </w:p>
+    <w:bookmarkEnd w:id="68"/>
+    <w:bookmarkStart w:id="70" w:name="ref-15"/>
+    <w:p>
+      <w:pPr>
+        <w:pStyle w:val="BodyText"/>
+      </w:pPr>
       <w:r>
         <w:t xml:space="preserve">[15]</w:t>
       </w:r>
       <w:r>
         <w:t xml:space="preserve"> </w:t>
       </w:r>
-      <w:hyperlink r:id="rId55">
+      <w:hyperlink r:id="rId69">
         <w:r>
           <w:rPr>
             <w:rStyle w:val="Hyperlink"/>
@@ -8605,16 +8481,20 @@
           <w:t xml:space="preserve">https://zpesystems.com</w:t>
         </w:r>
       </w:hyperlink>
-      <w:r>
-        <w:br/>
-      </w:r>
+    </w:p>
+    <w:bookmarkEnd w:id="70"/>
+    <w:bookmarkStart w:id="72" w:name="ref-16"/>
+    <w:p>
+      <w:pPr>
+        <w:pStyle w:val="BodyText"/>
+      </w:pPr>
       <w:r>
         <w:t xml:space="preserve">[16]</w:t>
       </w:r>
       <w:r>
         <w:t xml:space="preserve"> </w:t>
       </w:r>
-      <w:hyperlink r:id="rId56">
+      <w:hyperlink r:id="rId71">
         <w:r>
           <w:rPr>
             <w:rStyle w:val="Hyperlink"/>
@@ -8622,16 +8502,20 @@
           <w:t xml:space="preserve">https://www.youtube.com</w:t>
         </w:r>
       </w:hyperlink>
-      <w:r>
-        <w:br/>
-      </w:r>
+    </w:p>
+    <w:bookmarkEnd w:id="72"/>
+    <w:bookmarkStart w:id="74" w:name="ref-17"/>
+    <w:p>
+      <w:pPr>
+        <w:pStyle w:val="BodyText"/>
+      </w:pPr>
       <w:r>
         <w:t xml:space="preserve">[17]</w:t>
       </w:r>
       <w:r>
         <w:t xml:space="preserve"> </w:t>
       </w:r>
-      <w:hyperlink r:id="rId57">
+      <w:hyperlink r:id="rId73">
         <w:r>
           <w:rPr>
             <w:rStyle w:val="Hyperlink"/>
@@ -8639,16 +8523,20 @@
           <w:t xml:space="preserve">https://docs.zpesystems.com</w:t>
         </w:r>
       </w:hyperlink>
-      <w:r>
-        <w:br/>
-      </w:r>
+    </w:p>
+    <w:bookmarkEnd w:id="74"/>
+    <w:bookmarkStart w:id="76" w:name="ref-18"/>
+    <w:p>
+      <w:pPr>
+        <w:pStyle w:val="BodyText"/>
+      </w:pPr>
       <w:r>
         <w:t xml:space="preserve">[18]</w:t>
       </w:r>
       <w:r>
         <w:t xml:space="preserve"> </w:t>
       </w:r>
-      <w:hyperlink r:id="rId58">
+      <w:hyperlink r:id="rId75">
         <w:r>
           <w:rPr>
             <w:rStyle w:val="Hyperlink"/>
@@ -8656,16 +8544,20 @@
           <w:t xml:space="preserve">https://support.hpe.com</w:t>
         </w:r>
       </w:hyperlink>
-      <w:r>
-        <w:br/>
-      </w:r>
+    </w:p>
+    <w:bookmarkEnd w:id="76"/>
+    <w:bookmarkStart w:id="78" w:name="ref-19"/>
+    <w:p>
+      <w:pPr>
+        <w:pStyle w:val="BodyText"/>
+      </w:pPr>
       <w:r>
         <w:t xml:space="preserve">[19]</w:t>
       </w:r>
       <w:r>
         <w:t xml:space="preserve"> </w:t>
       </w:r>
-      <w:hyperlink r:id="rId59">
+      <w:hyperlink r:id="rId77">
         <w:r>
           <w:rPr>
             <w:rStyle w:val="Hyperlink"/>
@@ -8673,16 +8565,20 @@
           <w:t xml:space="preserve">https://support.hpe.com</w:t>
         </w:r>
       </w:hyperlink>
-      <w:r>
-        <w:br/>
-      </w:r>
+    </w:p>
+    <w:bookmarkEnd w:id="78"/>
+    <w:bookmarkStart w:id="80" w:name="ref-20"/>
+    <w:p>
+      <w:pPr>
+        <w:pStyle w:val="BodyText"/>
+      </w:pPr>
       <w:r>
         <w:t xml:space="preserve">[20]</w:t>
       </w:r>
       <w:r>
         <w:t xml:space="preserve"> </w:t>
       </w:r>
-      <w:hyperlink r:id="rId60">
+      <w:hyperlink r:id="rId79">
         <w:r>
           <w:rPr>
             <w:rStyle w:val="Hyperlink"/>
@@ -8690,16 +8586,20 @@
           <w:t xml:space="preserve">https://support.hpe.com</w:t>
         </w:r>
       </w:hyperlink>
-      <w:r>
-        <w:br/>
-      </w:r>
+    </w:p>
+    <w:bookmarkEnd w:id="80"/>
+    <w:bookmarkStart w:id="82" w:name="ref-21"/>
+    <w:p>
+      <w:pPr>
+        <w:pStyle w:val="BodyText"/>
+      </w:pPr>
       <w:r>
         <w:t xml:space="preserve">[21]</w:t>
       </w:r>
       <w:r>
         <w:t xml:space="preserve"> </w:t>
       </w:r>
-      <w:hyperlink r:id="rId61">
+      <w:hyperlink r:id="rId81">
         <w:r>
           <w:rPr>
             <w:rStyle w:val="Hyperlink"/>
@@ -8707,16 +8607,20 @@
           <w:t xml:space="preserve">https://community.hpe.com</w:t>
         </w:r>
       </w:hyperlink>
-      <w:r>
-        <w:br/>
-      </w:r>
+    </w:p>
+    <w:bookmarkEnd w:id="82"/>
+    <w:bookmarkStart w:id="84" w:name="ref-22"/>
+    <w:p>
+      <w:pPr>
+        <w:pStyle w:val="BodyText"/>
+      </w:pPr>
       <w:r>
         <w:t xml:space="preserve">[22]</w:t>
       </w:r>
       <w:r>
         <w:t xml:space="preserve"> </w:t>
       </w:r>
-      <w:hyperlink r:id="rId62">
+      <w:hyperlink r:id="rId83">
         <w:r>
           <w:rPr>
             <w:rStyle w:val="Hyperlink"/>
@@ -8725,8 +8629,9 @@
         </w:r>
       </w:hyperlink>
     </w:p>
-    <w:bookmarkEnd w:id="63"/>
-    <w:bookmarkEnd w:id="64"/>
+    <w:bookmarkEnd w:id="84"/>
+    <w:bookmarkEnd w:id="85"/>
+    <w:bookmarkEnd w:id="86"/>
     <w:sectPr>
       <w:footnotePr>
         <w:numRestart w:val="eachSect"/>

</xml_diff>